<commit_message>
Actualiza en el Manual Tecnico la tabla de tecnologias (Tailwind compilado, Font Awesome local)
La tabla 1 del Manual Tecnico (stack) decia que Tailwind CSS iba "3.x CDN" —
desactualizado desde la migracion a build (se compila con `npm run build:css`)
— y no aclaraba que Font Awesome ahora se sirve desde el propio servidor
(commit 8528a10, sin ningun CDN externo).

- Tailwind CSS: version "3.x (compilado)"; proposito "Estilos y dark mode (se
  compila en build, sin CDN)".
- Font Awesome: version "6.4.x (local)"; proposito "Iconografia (servido desde
  el propio servidor, sin CDN)".

Editado por Word COM sobre una copia y verificado antes de reemplazar el
original: de 853 parrafos cambiaron exactamente esas 4 celdas y el formato
(Calibri 9, sombreado alterno) quedo identico.

Co-Authored-By: Claude Sonnet 5 <noreply@anthropic.com>
</commit_message>
<xml_diff>
--- a/docs/Manual_Tecnico_LMS_CeNAT.docx
+++ b/docs/Manual_Tecnico_LMS_CeNAT.docx
@@ -956,7 +956,7 @@
                 <w:sz w:val="18"/>
                 <w:szCs w:val="18"/>
               </w:rPr>
-              <w:t>3.x CDN</w:t>
+              <w:t>3.x (compilado)</w:t>
             </w:r>
           </w:p>
         </w:tc>
@@ -972,7 +972,7 @@
                 <w:sz w:val="18"/>
                 <w:szCs w:val="18"/>
               </w:rPr>
-              <w:t>Estilos y dark mode</w:t>
+              <w:t>Estilos y dark mode (se compila en build, sin CDN)</w:t>
             </w:r>
           </w:p>
         </w:tc>
@@ -1022,7 +1022,7 @@
                 <w:sz w:val="18"/>
                 <w:szCs w:val="18"/>
               </w:rPr>
-              <w:t>6.4.x</w:t>
+              <w:t>6.4.x (local)</w:t>
             </w:r>
           </w:p>
         </w:tc>
@@ -1038,7 +1038,7 @@
                 <w:sz w:val="18"/>
                 <w:szCs w:val="18"/>
               </w:rPr>
-              <w:t>Iconografía</w:t>
+              <w:t>Iconografía (servido desde el propio servidor, sin CDN)</w:t>
             </w:r>
           </w:p>
         </w:tc>
@@ -1699,6 +1699,7 @@
         <w:spacing w:before="300" w:after="150"/>
       </w:pPr>
       <w:r>
+        <w:lastRenderedPageBreak/>
         <w:t>3.4 Crear la Base de Datos</w:t>
       </w:r>
     </w:p>
@@ -2359,6 +2360,7 @@
                 <w:sz w:val="18"/>
                 <w:szCs w:val="18"/>
               </w:rPr>
+              <w:lastRenderedPageBreak/>
               <w:t>src/utils/</w:t>
             </w:r>
           </w:p>
@@ -3776,6 +3778,7 @@
                 <w:sz w:val="18"/>
                 <w:szCs w:val="18"/>
               </w:rPr>
+              <w:lastRenderedPageBreak/>
               <w:t>POST</w:t>
             </w:r>
           </w:p>
@@ -5837,6 +5840,7 @@
                 <w:sz w:val="18"/>
                 <w:szCs w:val="18"/>
               </w:rPr>
+              <w:lastRenderedPageBreak/>
               <w:t>GET</w:t>
             </w:r>
           </w:p>
@@ -6973,6 +6977,7 @@
           </w:tcPr>
           <w:p>
             <w:r>
+              <w:lastRenderedPageBreak/>
               <w:t>GET</w:t>
             </w:r>
           </w:p>
@@ -7497,7 +7502,11 @@
           </w:tcPr>
           <w:p>
             <w:r>
-              <w:t>Página (?page, ?limit; 20 por defecto) de las respuestas de UNA pregunta de respuesta corta, ordenadas por id de estudiante: continúa donde terminan las que /results ya incluye. Responde 400 si la pregunta no es de respuesta corta y 404 si pertenece a otro contenido.</w:t>
+              <w:t xml:space="preserve">Página (?page, ?limit; 20 por defecto) de las respuestas de UNA pregunta de respuesta </w:t>
+            </w:r>
+            <w:r>
+              <w:lastRenderedPageBreak/>
+              <w:t>corta, ordenadas por id de estudiante: continúa donde terminan las que /results ya incluye. Responde 400 si la pregunta no es de respuesta corta y 404 si pertenece a otro contenido.</w:t>
             </w:r>
           </w:p>
         </w:tc>
@@ -7512,6 +7521,7 @@
           </w:tcPr>
           <w:p>
             <w:r>
+              <w:lastRenderedPageBreak/>
               <w:t>GET</w:t>
             </w:r>
           </w:p>
@@ -7926,6 +7936,7 @@
                 <w:sz w:val="18"/>
                 <w:szCs w:val="18"/>
               </w:rPr>
+              <w:lastRenderedPageBreak/>
               <w:t>enrollments</w:t>
             </w:r>
           </w:p>
@@ -8480,6 +8491,7 @@
         <w:spacing w:after="80"/>
       </w:pPr>
       <w:r>
+        <w:lastRenderedPageBreak/>
         <w:t>SESSION_SECRET es obligatoria: el servidor no arranca sin ella</w:t>
       </w:r>
     </w:p>
@@ -8754,6 +8766,7 @@
         <w:spacing w:after="80"/>
       </w:pPr>
       <w:r>
+        <w:lastRenderedPageBreak/>
         <w:t>Los errores de los body parsers de Express (JSON demasiado grande o mal formado) responden 413/400 con un mensaje traducido, sin filtrar el mensaje interno del parser</w:t>
       </w:r>
     </w:p>

</xml_diff>